<commit_message>
LINT del schema completo: alinea CLAUDE.md con la practica real
Corrige dos desalineaciones entre lo que decia el schema y las 48 paginas
existentes: el formato de la linea Categoria (el schema definia un enum
plano sin tilde, la practica usa la palabra con tilde mas una aclaracion
entre parentesis en las 48 paginas) y el formato de log.md (el schema solo
documentaba el prefijo "ingest", pero ya se usaban cinco tipos distintos).
Agrega PROFUNDIZACION como cuarta operacion formal. Prolija el diagrama
ASCII de la estructura de wiki/.

Actualiza tambien Monografia Maria Kamila vega version 1.docx con la
limpieza cosmetica de espacios en blanco hecha por el usuario en su PC.
</commit_message>
<xml_diff>
--- a/Monografia Maria Kamila vega version 1.docx
+++ b/Monografia Maria Kamila vega version 1.docx
@@ -548,18 +548,18 @@
         </w:pBdr>
         <w:ind w:left="283" w:firstLine="720"/>
         <w:jc w:val="center"/>
+      </w:pPr>
+      <w:r>
         <w:rPr>
           <w:color w:val="000000"/>
         </w:rPr>
-      </w:pPr>
-      <w:r>
-        <w:rPr>
-          <w:color w:val="000000"/>
-        </w:rPr>
         <w:t>Bogotá D.C, 202</w:t>
       </w:r>
       <w:r>
         <w:t>6</w:t>
+      </w:r>
+      <w:r>
+        <w:br w:type="page"/>
       </w:r>
     </w:p>
     <w:p>
@@ -575,60 +575,6 @@
         </w:pBdr>
         <w:spacing w:before="240" w:line="360" w:lineRule="auto"/>
         <w:rPr>
-          <w:sz w:val="36"/>
-          <w:szCs w:val="36"/>
-        </w:rPr>
-      </w:pPr>
-    </w:p>
-    <w:p>
-      <w:pPr>
-        <w:keepNext/>
-        <w:keepLines/>
-        <w:pBdr>
-          <w:top w:val="nil"/>
-          <w:left w:val="nil"/>
-          <w:bottom w:val="nil"/>
-          <w:right w:val="nil"/>
-          <w:between w:val="nil"/>
-        </w:pBdr>
-        <w:spacing w:before="240" w:line="360" w:lineRule="auto"/>
-        <w:rPr>
-          <w:sz w:val="36"/>
-          <w:szCs w:val="36"/>
-        </w:rPr>
-      </w:pPr>
-    </w:p>
-    <w:p>
-      <w:pPr>
-        <w:keepNext/>
-        <w:keepLines/>
-        <w:pBdr>
-          <w:top w:val="nil"/>
-          <w:left w:val="nil"/>
-          <w:bottom w:val="nil"/>
-          <w:right w:val="nil"/>
-          <w:between w:val="nil"/>
-        </w:pBdr>
-        <w:spacing w:before="240" w:line="360" w:lineRule="auto"/>
-        <w:rPr>
-          <w:sz w:val="36"/>
-          <w:szCs w:val="36"/>
-        </w:rPr>
-      </w:pPr>
-    </w:p>
-    <w:p>
-      <w:pPr>
-        <w:keepNext/>
-        <w:keepLines/>
-        <w:pBdr>
-          <w:top w:val="nil"/>
-          <w:left w:val="nil"/>
-          <w:bottom w:val="nil"/>
-          <w:right w:val="nil"/>
-          <w:between w:val="nil"/>
-        </w:pBdr>
-        <w:spacing w:before="240" w:line="360" w:lineRule="auto"/>
-        <w:rPr>
           <w:color w:val="000000"/>
           <w:sz w:val="36"/>
           <w:szCs w:val="36"/>
@@ -640,6 +586,7 @@
           <w:sz w:val="36"/>
           <w:szCs w:val="36"/>
         </w:rPr>
+        <w:lastRenderedPageBreak/>
         <w:t>Contenido</w:t>
       </w:r>
     </w:p>
@@ -656,7 +603,6 @@
           <w:docPartUnique/>
         </w:docPartObj>
       </w:sdtPr>
-      <w:sdtEndPr/>
       <w:sdtContent>
         <w:p>
           <w:pPr>
@@ -1450,35 +1396,44 @@
     </w:p>
     <w:p>
       <w:pPr>
-        <w:rPr>
+        <w:spacing w:line="360" w:lineRule="auto"/>
+        <w:rPr>
+          <w:rFonts w:ascii="Times New Roman" w:eastAsia="Times New Roman" w:hAnsi="Times New Roman" w:cs="Times New Roman"/>
           <w:b/>
           <w:bCs/>
           <w:color w:val="000000"/>
-          <w:sz w:val="26"/>
-          <w:szCs w:val="26"/>
         </w:rPr>
       </w:pPr>
       <w:bookmarkStart w:id="0" w:name="_p2cevyqp9roh" w:colFirst="0" w:colLast="0"/>
       <w:bookmarkEnd w:id="0"/>
-    </w:p>
-    <w:p>
-      <w:pPr>
-        <w:pStyle w:val="Ttulo2"/>
-        <w:jc w:val="center"/>
+      <w:r>
         <w:rPr>
           <w:rFonts w:ascii="Times New Roman" w:eastAsia="Times New Roman" w:hAnsi="Times New Roman" w:cs="Times New Roman"/>
           <w:b/>
           <w:bCs/>
           <w:color w:val="000000"/>
         </w:rPr>
-      </w:pPr>
-      <w:r>
+        <w:br w:type="page"/>
+      </w:r>
+    </w:p>
+    <w:p>
+      <w:pPr>
+        <w:spacing w:line="360" w:lineRule="auto"/>
         <w:rPr>
           <w:rFonts w:ascii="Times New Roman" w:eastAsia="Times New Roman" w:hAnsi="Times New Roman" w:cs="Times New Roman"/>
           <w:b/>
           <w:bCs/>
           <w:color w:val="000000"/>
         </w:rPr>
+      </w:pPr>
+      <w:r>
+        <w:rPr>
+          <w:rFonts w:ascii="Times New Roman" w:eastAsia="Times New Roman" w:hAnsi="Times New Roman" w:cs="Times New Roman"/>
+          <w:b/>
+          <w:bCs/>
+          <w:color w:val="000000"/>
+        </w:rPr>
+        <w:lastRenderedPageBreak/>
         <w:t>RESUMEN</w:t>
       </w:r>
     </w:p>
@@ -1638,7 +1593,6 @@
           <w:id w:val="1119652422"/>
           <w:citation/>
         </w:sdtPr>
-        <w:sdtEndPr/>
         <w:sdtContent>
           <w:r>
             <w:rPr>
@@ -2705,20 +2659,8 @@
           <w:szCs w:val="26"/>
         </w:rPr>
         <w:lastRenderedPageBreak/>
-        <w:t xml:space="preserve">Los objetivos que respaldan esta monografía </w:t>
-      </w:r>
-      <w:proofErr w:type="gramStart"/>
-      <w:r>
-        <w:rPr>
-          <w:rFonts w:ascii="Times New Roman" w:eastAsia="Times New Roman" w:hAnsi="Times New Roman" w:cs="Times New Roman"/>
-          <w:b/>
-          <w:bCs/>
-          <w:sz w:val="26"/>
-          <w:szCs w:val="26"/>
-        </w:rPr>
-        <w:t>son :</w:t>
-      </w:r>
-      <w:proofErr w:type="gramEnd"/>
+        <w:t>Los objetivos que respaldan esta monografía son:</w:t>
+      </w:r>
     </w:p>
     <w:p>
       <w:pPr>
@@ -3134,162 +3076,47 @@
         </w:rPr>
         <w:t>La combinación de ambos enfoques permitirá relacionar el análisis de las obras con las percepciones de los estudiantes, obteniendo una visión más completa sobre la representación del rol femenino y su posible relación con la manera en que este es percibido en la actualidad.</w:t>
       </w:r>
-    </w:p>
-    <w:p>
-      <w:pPr>
-        <w:pStyle w:val="Ttulo2"/>
-        <w:jc w:val="center"/>
-        <w:rPr>
-          <w:rFonts w:ascii="Times New Roman" w:eastAsia="Times New Roman" w:hAnsi="Times New Roman" w:cs="Times New Roman"/>
-          <w:b/>
-          <w:bCs/>
-          <w:color w:val="000000"/>
-        </w:rPr>
-      </w:pPr>
       <w:bookmarkStart w:id="34" w:name="_vnbytn3jelfm" w:colFirst="0" w:colLast="0"/>
+      <w:bookmarkStart w:id="35" w:name="_21ag4qn02n9r" w:colFirst="0" w:colLast="0"/>
+      <w:bookmarkStart w:id="36" w:name="_gg9loc15aj6u" w:colFirst="0" w:colLast="0"/>
+      <w:bookmarkStart w:id="37" w:name="_v0g8e0bnrfmv" w:colFirst="0" w:colLast="0"/>
+      <w:bookmarkStart w:id="38" w:name="_cok2uum8f83d" w:colFirst="0" w:colLast="0"/>
+      <w:bookmarkStart w:id="39" w:name="_848d8kgdbjnf" w:colFirst="0" w:colLast="0"/>
+      <w:bookmarkStart w:id="40" w:name="_ky0r26pbxzrl" w:colFirst="0" w:colLast="0"/>
+      <w:bookmarkStart w:id="41" w:name="_2numqmq3lttw" w:colFirst="0" w:colLast="0"/>
+      <w:bookmarkStart w:id="42" w:name="_83oric6wd8lf" w:colFirst="0" w:colLast="0"/>
+      <w:bookmarkStart w:id="43" w:name="_60t7sqfhis8h" w:colFirst="0" w:colLast="0"/>
+      <w:bookmarkStart w:id="44" w:name="_r2weoxfo0266" w:colFirst="0" w:colLast="0"/>
       <w:bookmarkEnd w:id="34"/>
-    </w:p>
-    <w:p>
-      <w:pPr>
-        <w:pStyle w:val="Ttulo2"/>
-        <w:jc w:val="center"/>
-        <w:rPr>
-          <w:rFonts w:ascii="Times New Roman" w:eastAsia="Times New Roman" w:hAnsi="Times New Roman" w:cs="Times New Roman"/>
-          <w:b/>
-          <w:bCs/>
-          <w:color w:val="000000"/>
-        </w:rPr>
-      </w:pPr>
-      <w:bookmarkStart w:id="35" w:name="_21ag4qn02n9r" w:colFirst="0" w:colLast="0"/>
       <w:bookmarkEnd w:id="35"/>
-    </w:p>
-    <w:p>
-      <w:pPr>
-        <w:pStyle w:val="Ttulo2"/>
-        <w:jc w:val="center"/>
-        <w:rPr>
-          <w:rFonts w:ascii="Times New Roman" w:eastAsia="Times New Roman" w:hAnsi="Times New Roman" w:cs="Times New Roman"/>
-          <w:b/>
-          <w:bCs/>
-          <w:color w:val="000000"/>
-        </w:rPr>
-      </w:pPr>
-      <w:bookmarkStart w:id="36" w:name="_gg9loc15aj6u" w:colFirst="0" w:colLast="0"/>
       <w:bookmarkEnd w:id="36"/>
-    </w:p>
-    <w:p>
-      <w:pPr>
-        <w:pStyle w:val="Ttulo2"/>
-        <w:jc w:val="center"/>
-        <w:rPr>
-          <w:rFonts w:ascii="Times New Roman" w:eastAsia="Times New Roman" w:hAnsi="Times New Roman" w:cs="Times New Roman"/>
-          <w:b/>
-          <w:bCs/>
-          <w:color w:val="000000"/>
-        </w:rPr>
-      </w:pPr>
-      <w:bookmarkStart w:id="37" w:name="_v0g8e0bnrfmv" w:colFirst="0" w:colLast="0"/>
       <w:bookmarkEnd w:id="37"/>
-    </w:p>
-    <w:p>
-      <w:pPr>
-        <w:pStyle w:val="Ttulo2"/>
-        <w:jc w:val="center"/>
-        <w:rPr>
-          <w:rFonts w:ascii="Times New Roman" w:eastAsia="Times New Roman" w:hAnsi="Times New Roman" w:cs="Times New Roman"/>
-          <w:b/>
-          <w:bCs/>
-          <w:color w:val="000000"/>
-        </w:rPr>
-      </w:pPr>
-      <w:bookmarkStart w:id="38" w:name="_cok2uum8f83d" w:colFirst="0" w:colLast="0"/>
       <w:bookmarkEnd w:id="38"/>
-    </w:p>
-    <w:p>
-      <w:pPr>
-        <w:pStyle w:val="Ttulo2"/>
-        <w:jc w:val="center"/>
-        <w:rPr>
-          <w:rFonts w:ascii="Times New Roman" w:eastAsia="Times New Roman" w:hAnsi="Times New Roman" w:cs="Times New Roman"/>
-          <w:b/>
-          <w:bCs/>
-          <w:color w:val="000000"/>
-        </w:rPr>
-      </w:pPr>
-      <w:bookmarkStart w:id="39" w:name="_848d8kgdbjnf" w:colFirst="0" w:colLast="0"/>
       <w:bookmarkEnd w:id="39"/>
-    </w:p>
-    <w:p>
-      <w:pPr>
-        <w:pStyle w:val="Ttulo2"/>
-        <w:jc w:val="center"/>
-        <w:rPr>
-          <w:rFonts w:ascii="Times New Roman" w:eastAsia="Times New Roman" w:hAnsi="Times New Roman" w:cs="Times New Roman"/>
-          <w:b/>
-          <w:bCs/>
-          <w:color w:val="000000"/>
-        </w:rPr>
-      </w:pPr>
-      <w:bookmarkStart w:id="40" w:name="_ky0r26pbxzrl" w:colFirst="0" w:colLast="0"/>
       <w:bookmarkEnd w:id="40"/>
-    </w:p>
-    <w:p>
-      <w:pPr>
-        <w:pStyle w:val="Ttulo2"/>
-        <w:jc w:val="center"/>
-        <w:rPr>
-          <w:rFonts w:ascii="Times New Roman" w:eastAsia="Times New Roman" w:hAnsi="Times New Roman" w:cs="Times New Roman"/>
-          <w:b/>
-          <w:bCs/>
-          <w:color w:val="000000"/>
-        </w:rPr>
-      </w:pPr>
-      <w:bookmarkStart w:id="41" w:name="_2numqmq3lttw" w:colFirst="0" w:colLast="0"/>
       <w:bookmarkEnd w:id="41"/>
-    </w:p>
-    <w:p>
-      <w:pPr>
-        <w:pStyle w:val="Ttulo2"/>
-        <w:jc w:val="center"/>
-        <w:rPr>
-          <w:rFonts w:ascii="Times New Roman" w:eastAsia="Times New Roman" w:hAnsi="Times New Roman" w:cs="Times New Roman"/>
-          <w:b/>
-          <w:bCs/>
-          <w:color w:val="000000"/>
-        </w:rPr>
-      </w:pPr>
-      <w:bookmarkStart w:id="42" w:name="_83oric6wd8lf" w:colFirst="0" w:colLast="0"/>
       <w:bookmarkEnd w:id="42"/>
-    </w:p>
-    <w:p>
-      <w:pPr>
-        <w:pStyle w:val="Ttulo2"/>
-        <w:rPr>
-          <w:rFonts w:ascii="Times New Roman" w:eastAsia="Times New Roman" w:hAnsi="Times New Roman" w:cs="Times New Roman"/>
-          <w:b/>
-          <w:bCs/>
-          <w:color w:val="000000"/>
-        </w:rPr>
-      </w:pPr>
-      <w:bookmarkStart w:id="43" w:name="_60t7sqfhis8h" w:colFirst="0" w:colLast="0"/>
       <w:bookmarkEnd w:id="43"/>
-    </w:p>
-    <w:p/>
-    <w:p/>
-    <w:p/>
-    <w:p/>
-    <w:p>
-      <w:pPr>
-        <w:pStyle w:val="Ttulo2"/>
-        <w:rPr>
-          <w:rFonts w:ascii="Times New Roman" w:eastAsia="Times New Roman" w:hAnsi="Times New Roman" w:cs="Times New Roman"/>
-          <w:b/>
-          <w:bCs/>
-          <w:color w:val="000000"/>
-        </w:rPr>
-      </w:pPr>
-      <w:bookmarkStart w:id="44" w:name="_r2weoxfo0266" w:colFirst="0" w:colLast="0"/>
       <w:bookmarkEnd w:id="44"/>
+      <w:r>
+        <w:rPr>
+          <w:rFonts w:ascii="Times New Roman" w:eastAsia="Times New Roman" w:hAnsi="Times New Roman" w:cs="Times New Roman"/>
+          <w:sz w:val="24"/>
+          <w:szCs w:val="24"/>
+        </w:rPr>
+        <w:br w:type="page"/>
+      </w:r>
+    </w:p>
+    <w:p>
+      <w:pPr>
+        <w:spacing w:line="360" w:lineRule="auto"/>
+        <w:jc w:val="both"/>
+        <w:rPr>
+          <w:rFonts w:ascii="Times New Roman" w:eastAsia="Times New Roman" w:hAnsi="Times New Roman" w:cs="Times New Roman"/>
+          <w:sz w:val="24"/>
+          <w:szCs w:val="24"/>
+        </w:rPr>
+      </w:pPr>
     </w:p>
     <w:p>
       <w:pPr>
@@ -5040,7 +4867,6 @@
                 <w:id w:val="111145805"/>
                 <w:bibliography/>
               </w:sdtPr>
-              <w:sdtEndPr/>
               <w:sdtContent>
                 <w:p>
                   <w:pPr>

</xml_diff>